<commit_message>
[update] Update the trading guide content (what % is profitable).
</commit_message>
<xml_diff>
--- a/pages/百科查阅/玩转江湖/WWM 市买玩法.docx
+++ b/pages/百科查阅/玩转江湖/WWM 市买玩法.docx
@@ -255,7 +255,7 @@
           <wp:inline distB="114300" distT="114300" distL="114300" distR="114300">
             <wp:extent cx="3019425" cy="3629025"/>
             <wp:effectExtent b="0" l="0" r="0" t="0"/>
-            <wp:docPr id="9" name="image3.png"/>
+            <wp:docPr id="10" name="image3.png"/>
             <a:graphic>
               <a:graphicData uri="http://schemas.openxmlformats.org/drawingml/2006/picture">
                 <pic:pic>
@@ -322,12 +322,12 @@
           <wp:inline distB="114300" distT="114300" distL="114300" distR="114300">
             <wp:extent cx="4409437" cy="4081463"/>
             <wp:effectExtent b="0" l="0" r="0" t="0"/>
-            <wp:docPr id="6" name="image6.png"/>
+            <wp:docPr id="6" name="image7.png"/>
             <a:graphic>
               <a:graphicData uri="http://schemas.openxmlformats.org/drawingml/2006/picture">
                 <pic:pic>
                   <pic:nvPicPr>
-                    <pic:cNvPr id="0" name="image6.png"/>
+                    <pic:cNvPr id="0" name="image7.png"/>
                     <pic:cNvPicPr preferRelativeResize="0"/>
                   </pic:nvPicPr>
                   <pic:blipFill>
@@ -383,7 +383,7 @@
       <w:pPr>
         <w:numPr>
           <w:ilvl w:val="0"/>
-          <w:numId w:val="2"/>
+          <w:numId w:val="3"/>
         </w:numPr>
         <w:ind w:left="720" w:hanging="360"/>
         <w:rPr>
@@ -402,7 +402,7 @@
       <w:pPr>
         <w:numPr>
           <w:ilvl w:val="0"/>
-          <w:numId w:val="2"/>
+          <w:numId w:val="3"/>
         </w:numPr>
         <w:ind w:left="720" w:hanging="360"/>
         <w:rPr>
@@ -507,14 +507,14 @@
         <w:rPr/>
         <w:drawing>
           <wp:inline distB="114300" distT="114300" distL="114300" distR="114300">
-            <wp:extent cx="6377362" cy="3515725"/>
+            <wp:extent cx="8534942" cy="4700588"/>
             <wp:effectExtent b="0" l="0" r="0" t="0"/>
-            <wp:docPr id="2" name="image7.png"/>
+            <wp:docPr id="2" name="image12.png"/>
             <a:graphic>
               <a:graphicData uri="http://schemas.openxmlformats.org/drawingml/2006/picture">
                 <pic:pic>
                   <pic:nvPicPr>
-                    <pic:cNvPr id="0" name="image7.png"/>
+                    <pic:cNvPr id="0" name="image12.png"/>
                     <pic:cNvPicPr preferRelativeResize="0"/>
                   </pic:nvPicPr>
                   <pic:blipFill>
@@ -527,7 +527,7 @@
                   <pic:spPr>
                     <a:xfrm>
                       <a:off x="0" y="0"/>
-                      <a:ext cx="6377362" cy="3515725"/>
+                      <a:ext cx="8534942" cy="4700588"/>
                     </a:xfrm>
                     <a:prstGeom prst="rect"/>
                     <a:ln/>
@@ -562,9 +562,9 @@
         <w:rPr/>
         <w:drawing>
           <wp:inline distB="114300" distT="114300" distL="114300" distR="114300">
-            <wp:extent cx="6376988" cy="3443982"/>
+            <wp:extent cx="9334632" cy="5043488"/>
             <wp:effectExtent b="0" l="0" r="0" t="0"/>
-            <wp:docPr id="11" name="image11.png"/>
+            <wp:docPr id="12" name="image11.png"/>
             <a:graphic>
               <a:graphicData uri="http://schemas.openxmlformats.org/drawingml/2006/picture">
                 <pic:pic>
@@ -582,7 +582,7 @@
                   <pic:spPr>
                     <a:xfrm>
                       <a:off x="0" y="0"/>
-                      <a:ext cx="6376988" cy="3443982"/>
+                      <a:ext cx="9334632" cy="5043488"/>
                     </a:xfrm>
                     <a:prstGeom prst="rect"/>
                     <a:ln/>
@@ -646,12 +646,12 @@
           <wp:inline distB="114300" distT="114300" distL="114300" distR="114300">
             <wp:extent cx="5534025" cy="3914775"/>
             <wp:effectExtent b="0" l="0" r="0" t="0"/>
-            <wp:docPr id="10" name="image5.png"/>
+            <wp:docPr id="11" name="image1.png"/>
             <a:graphic>
               <a:graphicData uri="http://schemas.openxmlformats.org/drawingml/2006/picture">
                 <pic:pic>
                   <pic:nvPicPr>
-                    <pic:cNvPr id="0" name="image5.png"/>
+                    <pic:cNvPr id="0" name="image1.png"/>
                     <pic:cNvPicPr preferRelativeResize="0"/>
                   </pic:nvPicPr>
                   <pic:blipFill>
@@ -707,7 +707,7 @@
       <w:pPr>
         <w:numPr>
           <w:ilvl w:val="0"/>
-          <w:numId w:val="3"/>
+          <w:numId w:val="4"/>
         </w:numPr>
         <w:ind w:left="720" w:hanging="360"/>
         <w:rPr>
@@ -726,7 +726,7 @@
       <w:pPr>
         <w:numPr>
           <w:ilvl w:val="0"/>
-          <w:numId w:val="3"/>
+          <w:numId w:val="4"/>
         </w:numPr>
         <w:ind w:left="720" w:hanging="360"/>
         <w:rPr>
@@ -761,7 +761,7 @@
       <w:pPr>
         <w:numPr>
           <w:ilvl w:val="1"/>
-          <w:numId w:val="3"/>
+          <w:numId w:val="4"/>
         </w:numPr>
         <w:ind w:left="1440" w:hanging="360"/>
         <w:rPr>
@@ -780,7 +780,7 @@
       <w:pPr>
         <w:numPr>
           <w:ilvl w:val="1"/>
-          <w:numId w:val="3"/>
+          <w:numId w:val="4"/>
         </w:numPr>
         <w:ind w:left="1440" w:hanging="360"/>
         <w:rPr>
@@ -799,7 +799,7 @@
       <w:pPr>
         <w:numPr>
           <w:ilvl w:val="1"/>
-          <w:numId w:val="3"/>
+          <w:numId w:val="4"/>
         </w:numPr>
         <w:ind w:left="1440" w:hanging="360"/>
         <w:rPr>
@@ -2032,6 +2032,21 @@
     </w:p>
     <w:p>
       <w:pPr>
+        <w:pStyle w:val="Heading2"/>
+        <w:rPr/>
+      </w:pPr>
+      <w:bookmarkStart w:colFirst="0" w:colLast="0" w:name="_2wfetamx67bd" w:id="8"/>
+      <w:bookmarkEnd w:id="8"/>
+      <w:r>
+        <w:rPr>
+          <w:rFonts w:ascii="Arial Unicode MS" w:cs="Arial Unicode MS" w:eastAsia="Arial Unicode MS" w:hAnsi="Arial Unicode MS"/>
+          <w:rtl w:val="0"/>
+        </w:rPr>
+        <w:t xml:space="preserve">什么福利？</w:t>
+      </w:r>
+    </w:p>
+    <w:p>
+      <w:pPr>
         <w:rPr/>
       </w:pPr>
       <w:r>
@@ -2109,12 +2124,12 @@
           <wp:inline distB="114300" distT="114300" distL="114300" distR="114300">
             <wp:extent cx="5943600" cy="3784600"/>
             <wp:effectExtent b="0" l="0" r="0" t="0"/>
-            <wp:docPr id="4" name="image1.png"/>
+            <wp:docPr id="4" name="image9.png"/>
             <a:graphic>
               <a:graphicData uri="http://schemas.openxmlformats.org/drawingml/2006/picture">
                 <pic:pic>
                   <pic:nvPicPr>
-                    <pic:cNvPr id="0" name="image1.png"/>
+                    <pic:cNvPr id="0" name="image9.png"/>
                     <pic:cNvPicPr preferRelativeResize="0"/>
                   </pic:nvPicPr>
                   <pic:blipFill>
@@ -2176,12 +2191,12 @@
           <wp:inline distB="114300" distT="114300" distL="114300" distR="114300">
             <wp:extent cx="5943600" cy="1854200"/>
             <wp:effectExtent b="0" l="0" r="0" t="0"/>
-            <wp:docPr id="5" name="image2.png"/>
+            <wp:docPr id="5" name="image10.png"/>
             <a:graphic>
               <a:graphicData uri="http://schemas.openxmlformats.org/drawingml/2006/picture">
                 <pic:pic>
                   <pic:nvPicPr>
-                    <pic:cNvPr id="0" name="image2.png"/>
+                    <pic:cNvPr id="0" name="image10.png"/>
                     <pic:cNvPicPr preferRelativeResize="0"/>
                   </pic:nvPicPr>
                   <pic:blipFill>
@@ -2221,12 +2236,12 @@
           <wp:inline distB="114300" distT="114300" distL="114300" distR="114300">
             <wp:extent cx="5943600" cy="1358900"/>
             <wp:effectExtent b="0" l="0" r="0" t="0"/>
-            <wp:docPr id="8" name="image9.png"/>
+            <wp:docPr id="8" name="image6.png"/>
             <a:graphic>
               <a:graphicData uri="http://schemas.openxmlformats.org/drawingml/2006/picture">
                 <pic:pic>
                   <pic:nvPicPr>
-                    <pic:cNvPr id="0" name="image9.png"/>
+                    <pic:cNvPr id="0" name="image6.png"/>
                     <pic:cNvPicPr preferRelativeResize="0"/>
                   </pic:nvPicPr>
                   <pic:blipFill>
@@ -2268,14 +2283,22 @@
     </w:p>
     <w:p>
       <w:pPr>
-        <w:rPr/>
-      </w:pPr>
-      <w:r>
-        <w:rPr>
-          <w:rFonts w:ascii="Arial Unicode MS" w:cs="Arial Unicode MS" w:eastAsia="Arial Unicode MS" w:hAnsi="Arial Unicode MS"/>
-          <w:rtl w:val="0"/>
-        </w:rPr>
-        <w:t xml:space="preserve">如何查看百业成员商品价格浮动情况：</w:t>
+        <w:pStyle w:val="Heading2"/>
+        <w:rPr/>
+      </w:pPr>
+      <w:bookmarkStart w:colFirst="0" w:colLast="0" w:name="_9y2nb215pht6" w:id="9"/>
+      <w:bookmarkEnd w:id="9"/>
+      <w:r>
+        <w:rPr>
+          <w:rFonts w:ascii="Arial Unicode MS" w:cs="Arial Unicode MS" w:eastAsia="Arial Unicode MS" w:hAnsi="Arial Unicode MS"/>
+          <w:rtl w:val="0"/>
+        </w:rPr>
+        <w:t xml:space="preserve">怎么找百业成员卖货？</w:t>
+      </w:r>
+      <w:r>
+        <w:rPr>
+          <w:rtl w:val="0"/>
+        </w:rPr>
       </w:r>
     </w:p>
     <w:p>
@@ -2300,12 +2323,12 @@
           <wp:inline distB="114300" distT="114300" distL="114300" distR="114300">
             <wp:extent cx="2628900" cy="4257675"/>
             <wp:effectExtent b="0" l="0" r="0" t="0"/>
-            <wp:docPr id="7" name="image10.png"/>
+            <wp:docPr id="7" name="image2.png"/>
             <a:graphic>
               <a:graphicData uri="http://schemas.openxmlformats.org/drawingml/2006/picture">
                 <pic:pic>
                   <pic:nvPicPr>
-                    <pic:cNvPr id="0" name="image10.png"/>
+                    <pic:cNvPr id="0" name="image2.png"/>
                     <pic:cNvPicPr preferRelativeResize="0"/>
                   </pic:nvPicPr>
                   <pic:blipFill>
@@ -2344,7 +2367,7 @@
           <w:rFonts w:ascii="Arial Unicode MS" w:cs="Arial Unicode MS" w:eastAsia="Arial Unicode MS" w:hAnsi="Arial Unicode MS"/>
           <w:rtl w:val="0"/>
         </w:rPr>
-        <w:t xml:space="preserve">与从不少对话可以查看到百业成员的价格（需要背包里面有对应商品）：</w:t>
+        <w:t xml:space="preserve">与从不少对话可以查看到百业成员的价格（需要背包里面有对应商品），也可以直接点击成员发送消息或者联机申请。</w:t>
       </w:r>
     </w:p>
     <w:p>
@@ -2392,6 +2415,1374 @@
         </w:rPr>
       </w:r>
     </w:p>
+    <w:p>
+      <w:pPr>
+        <w:rPr/>
+      </w:pPr>
+      <w:r>
+        <w:rPr>
+          <w:rtl w:val="0"/>
+        </w:rPr>
+      </w:r>
+    </w:p>
+    <w:p>
+      <w:pPr>
+        <w:pStyle w:val="Heading2"/>
+        <w:rPr/>
+      </w:pPr>
+      <w:bookmarkStart w:colFirst="0" w:colLast="0" w:name="_a7uyj6e7w6" w:id="10"/>
+      <w:bookmarkEnd w:id="10"/>
+      <w:r>
+        <w:rPr>
+          <w:rFonts w:ascii="Arial Unicode MS" w:cs="Arial Unicode MS" w:eastAsia="Arial Unicode MS" w:hAnsi="Arial Unicode MS"/>
+          <w:rtl w:val="0"/>
+        </w:rPr>
+        <w:t xml:space="preserve">什么时候卖给百业成员更划算？</w:t>
+      </w:r>
+    </w:p>
+    <w:p>
+      <w:pPr>
+        <w:rPr/>
+      </w:pPr>
+      <w:r>
+        <w:rPr>
+          <w:rFonts w:ascii="Arial Unicode MS" w:cs="Arial Unicode MS" w:eastAsia="Arial Unicode MS" w:hAnsi="Arial Unicode MS"/>
+          <w:rtl w:val="0"/>
+        </w:rPr>
+        <w:t xml:space="preserve">我们一下的数学计算的前提是百业技艺加成点满的情况：</w:t>
+      </w:r>
+    </w:p>
+    <w:p>
+      <w:pPr>
+        <w:numPr>
+          <w:ilvl w:val="0"/>
+          <w:numId w:val="2"/>
+        </w:numPr>
+        <w:ind w:left="720" w:hanging="360"/>
+        <w:rPr>
+          <w:u w:val="none"/>
+        </w:rPr>
+      </w:pPr>
+      <w:r>
+        <w:rPr>
+          <w:rFonts w:ascii="Arial Unicode MS" w:cs="Arial Unicode MS" w:eastAsia="Arial Unicode MS" w:hAnsi="Arial Unicode MS"/>
+          <w:rtl w:val="0"/>
+        </w:rPr>
+        <w:t xml:space="preserve">售卖加成： +14.5%</w:t>
+      </w:r>
+    </w:p>
+    <w:p>
+      <w:pPr>
+        <w:numPr>
+          <w:ilvl w:val="0"/>
+          <w:numId w:val="2"/>
+        </w:numPr>
+        <w:ind w:left="720" w:hanging="360"/>
+        <w:rPr>
+          <w:u w:val="none"/>
+        </w:rPr>
+      </w:pPr>
+      <w:r>
+        <w:rPr>
+          <w:rFonts w:ascii="Arial Unicode MS" w:cs="Arial Unicode MS" w:eastAsia="Arial Unicode MS" w:hAnsi="Arial Unicode MS"/>
+          <w:rtl w:val="0"/>
+        </w:rPr>
+        <w:t xml:space="preserve">税收减免： -10%</w:t>
+      </w:r>
+    </w:p>
+    <w:p>
+      <w:pPr>
+        <w:rPr/>
+      </w:pPr>
+      <w:r>
+        <w:rPr>
+          <w:rFonts w:ascii="Arial Unicode MS" w:cs="Arial Unicode MS" w:eastAsia="Arial Unicode MS" w:hAnsi="Arial Unicode MS"/>
+          <w:rtl w:val="0"/>
+        </w:rPr>
+        <w:t xml:space="preserve">另外，卖给其他玩家（包括自己）会有11%的税收扣除。</w:t>
+      </w:r>
+    </w:p>
+    <w:p>
+      <w:pPr>
+        <w:rPr/>
+      </w:pPr>
+      <w:r>
+        <w:rPr>
+          <w:rtl w:val="0"/>
+        </w:rPr>
+      </w:r>
+    </w:p>
+    <w:p>
+      <w:pPr>
+        <w:rPr/>
+      </w:pPr>
+      <w:r>
+        <w:rPr>
+          <w:rFonts w:ascii="Arial Unicode MS" w:cs="Arial Unicode MS" w:eastAsia="Arial Unicode MS" w:hAnsi="Arial Unicode MS"/>
+          <w:rtl w:val="0"/>
+        </w:rPr>
+        <w:t xml:space="preserve">以银杏价格为例子：</w:t>
+      </w:r>
+    </w:p>
+    <w:p>
+      <w:pPr>
+        <w:rPr/>
+      </w:pPr>
+      <w:r>
+        <w:rPr>
+          <w:rtl w:val="0"/>
+        </w:rPr>
+      </w:r>
+    </w:p>
+    <w:tbl>
+      <w:tblPr>
+        <w:tblStyle w:val="Table2"/>
+        <w:tblW w:w="9360.0" w:type="dxa"/>
+        <w:jc w:val="left"/>
+        <w:tblBorders>
+          <w:top w:color="000000" w:space="0" w:sz="8" w:val="single"/>
+          <w:left w:color="000000" w:space="0" w:sz="8" w:val="single"/>
+          <w:bottom w:color="000000" w:space="0" w:sz="8" w:val="single"/>
+          <w:right w:color="000000" w:space="0" w:sz="8" w:val="single"/>
+          <w:insideH w:color="000000" w:space="0" w:sz="8" w:val="single"/>
+          <w:insideV w:color="000000" w:space="0" w:sz="8" w:val="single"/>
+        </w:tblBorders>
+        <w:tblLayout w:type="fixed"/>
+        <w:tblLook w:val="0600"/>
+      </w:tblPr>
+      <w:tblGrid>
+        <w:gridCol w:w="1872"/>
+        <w:gridCol w:w="1872"/>
+        <w:gridCol w:w="1872"/>
+        <w:gridCol w:w="1872"/>
+        <w:gridCol w:w="1872"/>
+        <w:tblGridChange w:id="0">
+          <w:tblGrid>
+            <w:gridCol w:w="1872"/>
+            <w:gridCol w:w="1872"/>
+            <w:gridCol w:w="1872"/>
+            <w:gridCol w:w="1872"/>
+            <w:gridCol w:w="1872"/>
+          </w:tblGrid>
+        </w:tblGridChange>
+      </w:tblGrid>
+      <w:tr>
+        <w:trPr>
+          <w:cantSplit w:val="0"/>
+          <w:tblHeader w:val="0"/>
+        </w:trPr>
+        <w:tc>
+          <w:tcPr>
+            <w:shd w:fill="auto" w:val="clear"/>
+            <w:tcMar>
+              <w:top w:w="100.0" w:type="dxa"/>
+              <w:left w:w="100.0" w:type="dxa"/>
+              <w:bottom w:w="100.0" w:type="dxa"/>
+              <w:right w:w="100.0" w:type="dxa"/>
+            </w:tcMar>
+            <w:vAlign w:val="top"/>
+          </w:tcPr>
+          <w:p>
+            <w:pPr>
+              <w:keepNext w:val="0"/>
+              <w:keepLines w:val="0"/>
+              <w:pageBreakBefore w:val="0"/>
+              <w:widowControl w:val="0"/>
+              <w:pBdr>
+                <w:top w:space="0" w:sz="0" w:val="nil"/>
+                <w:left w:space="0" w:sz="0" w:val="nil"/>
+                <w:bottom w:space="0" w:sz="0" w:val="nil"/>
+                <w:right w:space="0" w:sz="0" w:val="nil"/>
+                <w:between w:space="0" w:sz="0" w:val="nil"/>
+              </w:pBdr>
+              <w:shd w:fill="auto" w:val="clear"/>
+              <w:spacing w:after="0" w:before="0" w:line="240" w:lineRule="auto"/>
+              <w:ind w:left="0" w:right="0" w:firstLine="0"/>
+              <w:jc w:val="left"/>
+              <w:rPr>
+                <w:b w:val="1"/>
+                <w:bCs w:val="1"/>
+              </w:rPr>
+            </w:pPr>
+            <w:r>
+              <w:rPr>
+                <w:rFonts w:ascii="Arial Unicode MS" w:cs="Arial Unicode MS" w:eastAsia="Arial Unicode MS" w:hAnsi="Arial Unicode MS"/>
+                <w:b w:val="1"/>
+                <w:bCs w:val="1"/>
+                <w:rtl w:val="0"/>
+              </w:rPr>
+              <w:t xml:space="preserve">银杏价格浮动</w:t>
+            </w:r>
+          </w:p>
+          <w:p>
+            <w:pPr>
+              <w:keepNext w:val="0"/>
+              <w:keepLines w:val="0"/>
+              <w:pageBreakBefore w:val="0"/>
+              <w:widowControl w:val="0"/>
+              <w:pBdr>
+                <w:top w:space="0" w:sz="0" w:val="nil"/>
+                <w:left w:space="0" w:sz="0" w:val="nil"/>
+                <w:bottom w:space="0" w:sz="0" w:val="nil"/>
+                <w:right w:space="0" w:sz="0" w:val="nil"/>
+                <w:between w:space="0" w:sz="0" w:val="nil"/>
+              </w:pBdr>
+              <w:shd w:fill="auto" w:val="clear"/>
+              <w:spacing w:after="0" w:before="0" w:line="240" w:lineRule="auto"/>
+              <w:ind w:left="0" w:right="0" w:firstLine="0"/>
+              <w:jc w:val="left"/>
+              <w:rPr>
+                <w:b w:val="1"/>
+                <w:bCs w:val="1"/>
+              </w:rPr>
+            </w:pPr>
+            <w:r>
+              <w:rPr>
+                <w:rFonts w:ascii="Arial Unicode MS" w:cs="Arial Unicode MS" w:eastAsia="Arial Unicode MS" w:hAnsi="Arial Unicode MS"/>
+                <w:b w:val="1"/>
+                <w:bCs w:val="1"/>
+                <w:rtl w:val="0"/>
+              </w:rPr>
+              <w:t xml:space="preserve">（原价36）</w:t>
+            </w:r>
+          </w:p>
+        </w:tc>
+        <w:tc>
+          <w:tcPr>
+            <w:shd w:fill="auto" w:val="clear"/>
+            <w:tcMar>
+              <w:top w:w="100.0" w:type="dxa"/>
+              <w:left w:w="100.0" w:type="dxa"/>
+              <w:bottom w:w="100.0" w:type="dxa"/>
+              <w:right w:w="100.0" w:type="dxa"/>
+            </w:tcMar>
+            <w:vAlign w:val="top"/>
+          </w:tcPr>
+          <w:p>
+            <w:pPr>
+              <w:keepNext w:val="0"/>
+              <w:keepLines w:val="0"/>
+              <w:pageBreakBefore w:val="0"/>
+              <w:widowControl w:val="0"/>
+              <w:pBdr>
+                <w:top w:space="0" w:sz="0" w:val="nil"/>
+                <w:left w:space="0" w:sz="0" w:val="nil"/>
+                <w:bottom w:space="0" w:sz="0" w:val="nil"/>
+                <w:right w:space="0" w:sz="0" w:val="nil"/>
+                <w:between w:space="0" w:sz="0" w:val="nil"/>
+              </w:pBdr>
+              <w:shd w:fill="auto" w:val="clear"/>
+              <w:spacing w:after="0" w:before="0" w:line="240" w:lineRule="auto"/>
+              <w:ind w:left="0" w:right="0" w:firstLine="0"/>
+              <w:jc w:val="left"/>
+              <w:rPr>
+                <w:b w:val="1"/>
+                <w:bCs w:val="1"/>
+              </w:rPr>
+            </w:pPr>
+            <w:r>
+              <w:rPr>
+                <w:rFonts w:ascii="Arial Unicode MS" w:cs="Arial Unicode MS" w:eastAsia="Arial Unicode MS" w:hAnsi="Arial Unicode MS"/>
+                <w:b w:val="1"/>
+                <w:bCs w:val="1"/>
+                <w:rtl w:val="0"/>
+              </w:rPr>
+              <w:t xml:space="preserve">浮动后价格</w:t>
+            </w:r>
+          </w:p>
+        </w:tc>
+        <w:tc>
+          <w:tcPr>
+            <w:shd w:fill="auto" w:val="clear"/>
+            <w:tcMar>
+              <w:top w:w="100.0" w:type="dxa"/>
+              <w:left w:w="100.0" w:type="dxa"/>
+              <w:bottom w:w="100.0" w:type="dxa"/>
+              <w:right w:w="100.0" w:type="dxa"/>
+            </w:tcMar>
+            <w:vAlign w:val="top"/>
+          </w:tcPr>
+          <w:p>
+            <w:pPr>
+              <w:keepNext w:val="0"/>
+              <w:keepLines w:val="0"/>
+              <w:pageBreakBefore w:val="0"/>
+              <w:widowControl w:val="0"/>
+              <w:pBdr>
+                <w:top w:space="0" w:sz="0" w:val="nil"/>
+                <w:left w:space="0" w:sz="0" w:val="nil"/>
+                <w:bottom w:space="0" w:sz="0" w:val="nil"/>
+                <w:right w:space="0" w:sz="0" w:val="nil"/>
+                <w:between w:space="0" w:sz="0" w:val="nil"/>
+              </w:pBdr>
+              <w:shd w:fill="auto" w:val="clear"/>
+              <w:spacing w:after="0" w:before="0" w:line="240" w:lineRule="auto"/>
+              <w:ind w:left="0" w:right="0" w:firstLine="0"/>
+              <w:jc w:val="left"/>
+              <w:rPr>
+                <w:b w:val="1"/>
+                <w:bCs w:val="1"/>
+              </w:rPr>
+            </w:pPr>
+            <w:r>
+              <w:rPr>
+                <w:rFonts w:ascii="Arial Unicode MS" w:cs="Arial Unicode MS" w:eastAsia="Arial Unicode MS" w:hAnsi="Arial Unicode MS"/>
+                <w:b w:val="1"/>
+                <w:bCs w:val="1"/>
+                <w:rtl w:val="0"/>
+              </w:rPr>
+              <w:t xml:space="preserve">其他玩家（包括自己）</w:t>
+            </w:r>
+          </w:p>
+        </w:tc>
+        <w:tc>
+          <w:tcPr>
+            <w:shd w:fill="auto" w:val="clear"/>
+            <w:tcMar>
+              <w:top w:w="100.0" w:type="dxa"/>
+              <w:left w:w="100.0" w:type="dxa"/>
+              <w:bottom w:w="100.0" w:type="dxa"/>
+              <w:right w:w="100.0" w:type="dxa"/>
+            </w:tcMar>
+            <w:vAlign w:val="top"/>
+          </w:tcPr>
+          <w:p>
+            <w:pPr>
+              <w:keepNext w:val="0"/>
+              <w:keepLines w:val="0"/>
+              <w:pageBreakBefore w:val="0"/>
+              <w:widowControl w:val="0"/>
+              <w:pBdr>
+                <w:top w:space="0" w:sz="0" w:val="nil"/>
+                <w:left w:space="0" w:sz="0" w:val="nil"/>
+                <w:bottom w:space="0" w:sz="0" w:val="nil"/>
+                <w:right w:space="0" w:sz="0" w:val="nil"/>
+                <w:between w:space="0" w:sz="0" w:val="nil"/>
+              </w:pBdr>
+              <w:shd w:fill="auto" w:val="clear"/>
+              <w:spacing w:after="0" w:before="0" w:line="240" w:lineRule="auto"/>
+              <w:ind w:left="0" w:right="0" w:firstLine="0"/>
+              <w:jc w:val="left"/>
+              <w:rPr>
+                <w:b w:val="1"/>
+                <w:bCs w:val="1"/>
+              </w:rPr>
+            </w:pPr>
+            <w:r>
+              <w:rPr>
+                <w:rFonts w:ascii="Arial Unicode MS" w:cs="Arial Unicode MS" w:eastAsia="Arial Unicode MS" w:hAnsi="Arial Unicode MS"/>
+                <w:b w:val="1"/>
+                <w:bCs w:val="1"/>
+                <w:rtl w:val="0"/>
+              </w:rPr>
+              <w:t xml:space="preserve">百业成员（福利拉满）</w:t>
+            </w:r>
+          </w:p>
+        </w:tc>
+        <w:tc>
+          <w:tcPr>
+            <w:shd w:fill="auto" w:val="clear"/>
+            <w:tcMar>
+              <w:top w:w="100.0" w:type="dxa"/>
+              <w:left w:w="100.0" w:type="dxa"/>
+              <w:bottom w:w="100.0" w:type="dxa"/>
+              <w:right w:w="100.0" w:type="dxa"/>
+            </w:tcMar>
+            <w:vAlign w:val="top"/>
+          </w:tcPr>
+          <w:p>
+            <w:pPr>
+              <w:keepNext w:val="0"/>
+              <w:keepLines w:val="0"/>
+              <w:pageBreakBefore w:val="0"/>
+              <w:widowControl w:val="0"/>
+              <w:pBdr>
+                <w:top w:space="0" w:sz="0" w:val="nil"/>
+                <w:left w:space="0" w:sz="0" w:val="nil"/>
+                <w:bottom w:space="0" w:sz="0" w:val="nil"/>
+                <w:right w:space="0" w:sz="0" w:val="nil"/>
+                <w:between w:space="0" w:sz="0" w:val="nil"/>
+              </w:pBdr>
+              <w:shd w:fill="auto" w:val="clear"/>
+              <w:spacing w:after="0" w:before="0" w:line="240" w:lineRule="auto"/>
+              <w:ind w:left="0" w:right="0" w:firstLine="0"/>
+              <w:jc w:val="left"/>
+              <w:rPr>
+                <w:b w:val="1"/>
+                <w:bCs w:val="1"/>
+              </w:rPr>
+            </w:pPr>
+            <w:r>
+              <w:rPr>
+                <w:rFonts w:ascii="Arial Unicode MS" w:cs="Arial Unicode MS" w:eastAsia="Arial Unicode MS" w:hAnsi="Arial Unicode MS"/>
+                <w:b w:val="1"/>
+                <w:bCs w:val="1"/>
+                <w:rtl w:val="0"/>
+              </w:rPr>
+              <w:t xml:space="preserve">备注</w:t>
+            </w:r>
+          </w:p>
+        </w:tc>
+      </w:tr>
+      <w:tr>
+        <w:trPr>
+          <w:cantSplit w:val="0"/>
+          <w:tblHeader w:val="0"/>
+        </w:trPr>
+        <w:tc>
+          <w:tcPr>
+            <w:shd w:fill="auto" w:val="clear"/>
+            <w:tcMar>
+              <w:top w:w="100.0" w:type="dxa"/>
+              <w:left w:w="100.0" w:type="dxa"/>
+              <w:bottom w:w="100.0" w:type="dxa"/>
+              <w:right w:w="100.0" w:type="dxa"/>
+            </w:tcMar>
+            <w:vAlign w:val="top"/>
+          </w:tcPr>
+          <w:p>
+            <w:pPr>
+              <w:keepNext w:val="0"/>
+              <w:keepLines w:val="0"/>
+              <w:pageBreakBefore w:val="0"/>
+              <w:widowControl w:val="0"/>
+              <w:pBdr>
+                <w:top w:space="0" w:sz="0" w:val="nil"/>
+                <w:left w:space="0" w:sz="0" w:val="nil"/>
+                <w:bottom w:space="0" w:sz="0" w:val="nil"/>
+                <w:right w:space="0" w:sz="0" w:val="nil"/>
+                <w:between w:space="0" w:sz="0" w:val="nil"/>
+              </w:pBdr>
+              <w:shd w:fill="auto" w:val="clear"/>
+              <w:spacing w:after="0" w:before="0" w:line="240" w:lineRule="auto"/>
+              <w:ind w:left="0" w:right="0" w:firstLine="0"/>
+              <w:jc w:val="left"/>
+              <w:rPr/>
+            </w:pPr>
+            <w:r>
+              <w:rPr>
+                <w:rtl w:val="0"/>
+              </w:rPr>
+              <w:t xml:space="preserve">0%</w:t>
+            </w:r>
+          </w:p>
+        </w:tc>
+        <w:tc>
+          <w:tcPr>
+            <w:shd w:fill="auto" w:val="clear"/>
+            <w:tcMar>
+              <w:top w:w="100.0" w:type="dxa"/>
+              <w:left w:w="100.0" w:type="dxa"/>
+              <w:bottom w:w="100.0" w:type="dxa"/>
+              <w:right w:w="100.0" w:type="dxa"/>
+            </w:tcMar>
+            <w:vAlign w:val="top"/>
+          </w:tcPr>
+          <w:p>
+            <w:pPr>
+              <w:keepNext w:val="0"/>
+              <w:keepLines w:val="0"/>
+              <w:pageBreakBefore w:val="0"/>
+              <w:widowControl w:val="0"/>
+              <w:pBdr>
+                <w:top w:space="0" w:sz="0" w:val="nil"/>
+                <w:left w:space="0" w:sz="0" w:val="nil"/>
+                <w:bottom w:space="0" w:sz="0" w:val="nil"/>
+                <w:right w:space="0" w:sz="0" w:val="nil"/>
+                <w:between w:space="0" w:sz="0" w:val="nil"/>
+              </w:pBdr>
+              <w:shd w:fill="auto" w:val="clear"/>
+              <w:spacing w:after="0" w:before="0" w:line="240" w:lineRule="auto"/>
+              <w:ind w:left="0" w:right="0" w:firstLine="0"/>
+              <w:jc w:val="left"/>
+              <w:rPr/>
+            </w:pPr>
+            <w:r>
+              <w:rPr>
+                <w:rtl w:val="0"/>
+              </w:rPr>
+              <w:t xml:space="preserve">36</w:t>
+            </w:r>
+          </w:p>
+        </w:tc>
+        <w:tc>
+          <w:tcPr>
+            <w:shd w:fill="auto" w:val="clear"/>
+            <w:tcMar>
+              <w:top w:w="100.0" w:type="dxa"/>
+              <w:left w:w="100.0" w:type="dxa"/>
+              <w:bottom w:w="100.0" w:type="dxa"/>
+              <w:right w:w="100.0" w:type="dxa"/>
+            </w:tcMar>
+            <w:vAlign w:val="top"/>
+          </w:tcPr>
+          <w:p>
+            <w:pPr>
+              <w:keepNext w:val="0"/>
+              <w:keepLines w:val="0"/>
+              <w:pageBreakBefore w:val="0"/>
+              <w:widowControl w:val="0"/>
+              <w:pBdr>
+                <w:top w:space="0" w:sz="0" w:val="nil"/>
+                <w:left w:space="0" w:sz="0" w:val="nil"/>
+                <w:bottom w:space="0" w:sz="0" w:val="nil"/>
+                <w:right w:space="0" w:sz="0" w:val="nil"/>
+                <w:between w:space="0" w:sz="0" w:val="nil"/>
+              </w:pBdr>
+              <w:shd w:fill="auto" w:val="clear"/>
+              <w:spacing w:after="0" w:before="0" w:line="240" w:lineRule="auto"/>
+              <w:ind w:left="0" w:right="0" w:firstLine="0"/>
+              <w:jc w:val="left"/>
+              <w:rPr/>
+            </w:pPr>
+            <w:r>
+              <w:rPr>
+                <w:rtl w:val="0"/>
+              </w:rPr>
+              <w:t xml:space="preserve">36 - 36 x 11% = 32.04 = 32</w:t>
+            </w:r>
+          </w:p>
+        </w:tc>
+        <w:tc>
+          <w:tcPr>
+            <w:shd w:fill="auto" w:val="clear"/>
+            <w:tcMar>
+              <w:top w:w="100.0" w:type="dxa"/>
+              <w:left w:w="100.0" w:type="dxa"/>
+              <w:bottom w:w="100.0" w:type="dxa"/>
+              <w:right w:w="100.0" w:type="dxa"/>
+            </w:tcMar>
+            <w:vAlign w:val="top"/>
+          </w:tcPr>
+          <w:p>
+            <w:pPr>
+              <w:keepNext w:val="0"/>
+              <w:keepLines w:val="0"/>
+              <w:pageBreakBefore w:val="0"/>
+              <w:widowControl w:val="0"/>
+              <w:pBdr>
+                <w:top w:space="0" w:sz="0" w:val="nil"/>
+                <w:left w:space="0" w:sz="0" w:val="nil"/>
+                <w:bottom w:space="0" w:sz="0" w:val="nil"/>
+                <w:right w:space="0" w:sz="0" w:val="nil"/>
+                <w:between w:space="0" w:sz="0" w:val="nil"/>
+              </w:pBdr>
+              <w:shd w:fill="auto" w:val="clear"/>
+              <w:spacing w:after="0" w:before="0" w:line="240" w:lineRule="auto"/>
+              <w:ind w:left="0" w:right="0" w:firstLine="0"/>
+              <w:jc w:val="left"/>
+              <w:rPr/>
+            </w:pPr>
+            <w:r>
+              <w:rPr>
+                <w:rtl w:val="0"/>
+              </w:rPr>
+              <w:t xml:space="preserve">(36 x (1 + 14.5%)) x (1 - 1%) = 40.8 = 41</w:t>
+            </w:r>
+          </w:p>
+        </w:tc>
+        <w:tc>
+          <w:tcPr>
+            <w:shd w:fill="auto" w:val="clear"/>
+            <w:tcMar>
+              <w:top w:w="100.0" w:type="dxa"/>
+              <w:left w:w="100.0" w:type="dxa"/>
+              <w:bottom w:w="100.0" w:type="dxa"/>
+              <w:right w:w="100.0" w:type="dxa"/>
+            </w:tcMar>
+            <w:vAlign w:val="top"/>
+          </w:tcPr>
+          <w:p>
+            <w:pPr>
+              <w:keepNext w:val="0"/>
+              <w:keepLines w:val="0"/>
+              <w:pageBreakBefore w:val="0"/>
+              <w:widowControl w:val="0"/>
+              <w:pBdr>
+                <w:top w:space="0" w:sz="0" w:val="nil"/>
+                <w:left w:space="0" w:sz="0" w:val="nil"/>
+                <w:bottom w:space="0" w:sz="0" w:val="nil"/>
+                <w:right w:space="0" w:sz="0" w:val="nil"/>
+                <w:between w:space="0" w:sz="0" w:val="nil"/>
+              </w:pBdr>
+              <w:shd w:fill="auto" w:val="clear"/>
+              <w:spacing w:after="0" w:before="0" w:line="240" w:lineRule="auto"/>
+              <w:ind w:left="0" w:right="0" w:firstLine="0"/>
+              <w:jc w:val="left"/>
+              <w:rPr/>
+            </w:pPr>
+            <w:r>
+              <w:rPr>
+                <w:rFonts w:ascii="Arial Unicode MS" w:cs="Arial Unicode MS" w:eastAsia="Arial Unicode MS" w:hAnsi="Arial Unicode MS"/>
+                <w:rtl w:val="0"/>
+              </w:rPr>
+              <w:t xml:space="preserve">即便是最低的0%, 卖给百业成员也不亏钱。</w:t>
+            </w:r>
+          </w:p>
+        </w:tc>
+      </w:tr>
+      <w:tr>
+        <w:trPr>
+          <w:cantSplit w:val="0"/>
+          <w:tblHeader w:val="0"/>
+        </w:trPr>
+        <w:tc>
+          <w:tcPr>
+            <w:shd w:fill="auto" w:val="clear"/>
+            <w:tcMar>
+              <w:top w:w="100.0" w:type="dxa"/>
+              <w:left w:w="100.0" w:type="dxa"/>
+              <w:bottom w:w="100.0" w:type="dxa"/>
+              <w:right w:w="100.0" w:type="dxa"/>
+            </w:tcMar>
+            <w:vAlign w:val="top"/>
+          </w:tcPr>
+          <w:p>
+            <w:pPr>
+              <w:keepNext w:val="0"/>
+              <w:keepLines w:val="0"/>
+              <w:pageBreakBefore w:val="0"/>
+              <w:widowControl w:val="0"/>
+              <w:pBdr>
+                <w:top w:space="0" w:sz="0" w:val="nil"/>
+                <w:left w:space="0" w:sz="0" w:val="nil"/>
+                <w:bottom w:space="0" w:sz="0" w:val="nil"/>
+                <w:right w:space="0" w:sz="0" w:val="nil"/>
+                <w:between w:space="0" w:sz="0" w:val="nil"/>
+              </w:pBdr>
+              <w:shd w:fill="auto" w:val="clear"/>
+              <w:spacing w:after="0" w:before="0" w:line="240" w:lineRule="auto"/>
+              <w:ind w:left="0" w:right="0" w:firstLine="0"/>
+              <w:jc w:val="left"/>
+              <w:rPr/>
+            </w:pPr>
+            <w:r>
+              <w:rPr>
+                <w:rtl w:val="0"/>
+              </w:rPr>
+              <w:t xml:space="preserve">113%</w:t>
+            </w:r>
+          </w:p>
+        </w:tc>
+        <w:tc>
+          <w:tcPr>
+            <w:shd w:fill="auto" w:val="clear"/>
+            <w:tcMar>
+              <w:top w:w="100.0" w:type="dxa"/>
+              <w:left w:w="100.0" w:type="dxa"/>
+              <w:bottom w:w="100.0" w:type="dxa"/>
+              <w:right w:w="100.0" w:type="dxa"/>
+            </w:tcMar>
+            <w:vAlign w:val="top"/>
+          </w:tcPr>
+          <w:p>
+            <w:pPr>
+              <w:keepNext w:val="0"/>
+              <w:keepLines w:val="0"/>
+              <w:pageBreakBefore w:val="0"/>
+              <w:widowControl w:val="0"/>
+              <w:pBdr>
+                <w:top w:space="0" w:sz="0" w:val="nil"/>
+                <w:left w:space="0" w:sz="0" w:val="nil"/>
+                <w:bottom w:space="0" w:sz="0" w:val="nil"/>
+                <w:right w:space="0" w:sz="0" w:val="nil"/>
+                <w:between w:space="0" w:sz="0" w:val="nil"/>
+              </w:pBdr>
+              <w:shd w:fill="auto" w:val="clear"/>
+              <w:spacing w:after="0" w:before="0" w:line="240" w:lineRule="auto"/>
+              <w:ind w:left="0" w:right="0" w:firstLine="0"/>
+              <w:jc w:val="left"/>
+              <w:rPr/>
+            </w:pPr>
+            <w:r>
+              <w:rPr>
+                <w:rtl w:val="0"/>
+              </w:rPr>
+              <w:t xml:space="preserve">41 (40.68)</w:t>
+            </w:r>
+          </w:p>
+        </w:tc>
+        <w:tc>
+          <w:tcPr>
+            <w:shd w:fill="auto" w:val="clear"/>
+            <w:tcMar>
+              <w:top w:w="100.0" w:type="dxa"/>
+              <w:left w:w="100.0" w:type="dxa"/>
+              <w:bottom w:w="100.0" w:type="dxa"/>
+              <w:right w:w="100.0" w:type="dxa"/>
+            </w:tcMar>
+            <w:vAlign w:val="top"/>
+          </w:tcPr>
+          <w:p>
+            <w:pPr>
+              <w:keepNext w:val="0"/>
+              <w:keepLines w:val="0"/>
+              <w:pageBreakBefore w:val="0"/>
+              <w:widowControl w:val="0"/>
+              <w:pBdr>
+                <w:top w:space="0" w:sz="0" w:val="nil"/>
+                <w:left w:space="0" w:sz="0" w:val="nil"/>
+                <w:bottom w:space="0" w:sz="0" w:val="nil"/>
+                <w:right w:space="0" w:sz="0" w:val="nil"/>
+                <w:between w:space="0" w:sz="0" w:val="nil"/>
+              </w:pBdr>
+              <w:shd w:fill="auto" w:val="clear"/>
+              <w:spacing w:after="0" w:before="0" w:line="240" w:lineRule="auto"/>
+              <w:ind w:left="0" w:right="0" w:firstLine="0"/>
+              <w:jc w:val="left"/>
+              <w:rPr/>
+            </w:pPr>
+            <w:r>
+              <w:rPr>
+                <w:rtl w:val="0"/>
+              </w:rPr>
+              <w:t xml:space="preserve">41 - 41 x 11% = 36.49 = 36</w:t>
+            </w:r>
+          </w:p>
+        </w:tc>
+        <w:tc>
+          <w:tcPr>
+            <w:shd w:fill="auto" w:val="clear"/>
+            <w:tcMar>
+              <w:top w:w="100.0" w:type="dxa"/>
+              <w:left w:w="100.0" w:type="dxa"/>
+              <w:bottom w:w="100.0" w:type="dxa"/>
+              <w:right w:w="100.0" w:type="dxa"/>
+            </w:tcMar>
+            <w:vAlign w:val="top"/>
+          </w:tcPr>
+          <w:p>
+            <w:pPr>
+              <w:widowControl w:val="0"/>
+              <w:spacing w:line="240" w:lineRule="auto"/>
+              <w:rPr/>
+            </w:pPr>
+            <w:r>
+              <w:rPr>
+                <w:rtl w:val="0"/>
+              </w:rPr>
+              <w:t xml:space="preserve">(41 x (1 + 14.5%)) x (1 - 1%) = 46.48 = 46</w:t>
+            </w:r>
+          </w:p>
+        </w:tc>
+        <w:tc>
+          <w:tcPr>
+            <w:shd w:fill="auto" w:val="clear"/>
+            <w:tcMar>
+              <w:top w:w="100.0" w:type="dxa"/>
+              <w:left w:w="100.0" w:type="dxa"/>
+              <w:bottom w:w="100.0" w:type="dxa"/>
+              <w:right w:w="100.0" w:type="dxa"/>
+            </w:tcMar>
+            <w:vAlign w:val="top"/>
+          </w:tcPr>
+          <w:p>
+            <w:pPr>
+              <w:keepNext w:val="0"/>
+              <w:keepLines w:val="0"/>
+              <w:pageBreakBefore w:val="0"/>
+              <w:widowControl w:val="0"/>
+              <w:pBdr>
+                <w:top w:space="0" w:sz="0" w:val="nil"/>
+                <w:left w:space="0" w:sz="0" w:val="nil"/>
+                <w:bottom w:space="0" w:sz="0" w:val="nil"/>
+                <w:right w:space="0" w:sz="0" w:val="nil"/>
+                <w:between w:space="0" w:sz="0" w:val="nil"/>
+              </w:pBdr>
+              <w:shd w:fill="auto" w:val="clear"/>
+              <w:spacing w:after="0" w:before="0" w:line="240" w:lineRule="auto"/>
+              <w:ind w:left="0" w:right="0" w:firstLine="0"/>
+              <w:jc w:val="left"/>
+              <w:rPr/>
+            </w:pPr>
+            <w:r>
+              <w:rPr>
+                <w:rFonts w:ascii="Arial Unicode MS" w:cs="Arial Unicode MS" w:eastAsia="Arial Unicode MS" w:hAnsi="Arial Unicode MS"/>
+                <w:rtl w:val="0"/>
+              </w:rPr>
+              <w:t xml:space="preserve">113% 以上卖给非百业成员也不亏了。</w:t>
+            </w:r>
+          </w:p>
+        </w:tc>
+      </w:tr>
+      <w:tr>
+        <w:trPr>
+          <w:cantSplit w:val="0"/>
+          <w:tblHeader w:val="0"/>
+        </w:trPr>
+        <w:tc>
+          <w:tcPr>
+            <w:shd w:fill="auto" w:val="clear"/>
+            <w:tcMar>
+              <w:top w:w="100.0" w:type="dxa"/>
+              <w:left w:w="100.0" w:type="dxa"/>
+              <w:bottom w:w="100.0" w:type="dxa"/>
+              <w:right w:w="100.0" w:type="dxa"/>
+            </w:tcMar>
+            <w:vAlign w:val="top"/>
+          </w:tcPr>
+          <w:p>
+            <w:pPr>
+              <w:keepNext w:val="0"/>
+              <w:keepLines w:val="0"/>
+              <w:pageBreakBefore w:val="0"/>
+              <w:widowControl w:val="0"/>
+              <w:pBdr>
+                <w:top w:space="0" w:sz="0" w:val="nil"/>
+                <w:left w:space="0" w:sz="0" w:val="nil"/>
+                <w:bottom w:space="0" w:sz="0" w:val="nil"/>
+                <w:right w:space="0" w:sz="0" w:val="nil"/>
+                <w:between w:space="0" w:sz="0" w:val="nil"/>
+              </w:pBdr>
+              <w:shd w:fill="auto" w:val="clear"/>
+              <w:spacing w:after="0" w:before="0" w:line="240" w:lineRule="auto"/>
+              <w:ind w:left="0" w:right="0" w:firstLine="0"/>
+              <w:jc w:val="left"/>
+              <w:rPr/>
+            </w:pPr>
+            <w:r>
+              <w:rPr>
+                <w:rtl w:val="0"/>
+              </w:rPr>
+              <w:t xml:space="preserve">236%</w:t>
+            </w:r>
+          </w:p>
+        </w:tc>
+        <w:tc>
+          <w:tcPr>
+            <w:shd w:fill="auto" w:val="clear"/>
+            <w:tcMar>
+              <w:top w:w="100.0" w:type="dxa"/>
+              <w:left w:w="100.0" w:type="dxa"/>
+              <w:bottom w:w="100.0" w:type="dxa"/>
+              <w:right w:w="100.0" w:type="dxa"/>
+            </w:tcMar>
+            <w:vAlign w:val="top"/>
+          </w:tcPr>
+          <w:p>
+            <w:pPr>
+              <w:keepNext w:val="0"/>
+              <w:keepLines w:val="0"/>
+              <w:pageBreakBefore w:val="0"/>
+              <w:widowControl w:val="0"/>
+              <w:pBdr>
+                <w:top w:space="0" w:sz="0" w:val="nil"/>
+                <w:left w:space="0" w:sz="0" w:val="nil"/>
+                <w:bottom w:space="0" w:sz="0" w:val="nil"/>
+                <w:right w:space="0" w:sz="0" w:val="nil"/>
+                <w:between w:space="0" w:sz="0" w:val="nil"/>
+              </w:pBdr>
+              <w:shd w:fill="auto" w:val="clear"/>
+              <w:spacing w:after="0" w:before="0" w:line="240" w:lineRule="auto"/>
+              <w:ind w:left="0" w:right="0" w:firstLine="0"/>
+              <w:jc w:val="left"/>
+              <w:rPr/>
+            </w:pPr>
+            <w:r>
+              <w:rPr>
+                <w:rtl w:val="0"/>
+              </w:rPr>
+              <w:t xml:space="preserve">85 (84.96)</w:t>
+            </w:r>
+          </w:p>
+        </w:tc>
+        <w:tc>
+          <w:tcPr>
+            <w:shd w:fill="auto" w:val="clear"/>
+            <w:tcMar>
+              <w:top w:w="100.0" w:type="dxa"/>
+              <w:left w:w="100.0" w:type="dxa"/>
+              <w:bottom w:w="100.0" w:type="dxa"/>
+              <w:right w:w="100.0" w:type="dxa"/>
+            </w:tcMar>
+            <w:vAlign w:val="top"/>
+          </w:tcPr>
+          <w:p>
+            <w:pPr>
+              <w:keepNext w:val="0"/>
+              <w:keepLines w:val="0"/>
+              <w:pageBreakBefore w:val="0"/>
+              <w:widowControl w:val="0"/>
+              <w:pBdr>
+                <w:top w:space="0" w:sz="0" w:val="nil"/>
+                <w:left w:space="0" w:sz="0" w:val="nil"/>
+                <w:bottom w:space="0" w:sz="0" w:val="nil"/>
+                <w:right w:space="0" w:sz="0" w:val="nil"/>
+                <w:between w:space="0" w:sz="0" w:val="nil"/>
+              </w:pBdr>
+              <w:shd w:fill="auto" w:val="clear"/>
+              <w:spacing w:after="0" w:before="0" w:line="240" w:lineRule="auto"/>
+              <w:ind w:left="0" w:right="0" w:firstLine="0"/>
+              <w:jc w:val="left"/>
+              <w:rPr/>
+            </w:pPr>
+            <w:r>
+              <w:rPr>
+                <w:rtl w:val="0"/>
+              </w:rPr>
+              <w:t xml:space="preserve">85 - 85 x 11% = 75.65 = 76</w:t>
+            </w:r>
+          </w:p>
+        </w:tc>
+        <w:tc>
+          <w:tcPr>
+            <w:shd w:fill="auto" w:val="clear"/>
+            <w:tcMar>
+              <w:top w:w="100.0" w:type="dxa"/>
+              <w:left w:w="100.0" w:type="dxa"/>
+              <w:bottom w:w="100.0" w:type="dxa"/>
+              <w:right w:w="100.0" w:type="dxa"/>
+            </w:tcMar>
+            <w:vAlign w:val="top"/>
+          </w:tcPr>
+          <w:p>
+            <w:pPr>
+              <w:widowControl w:val="0"/>
+              <w:spacing w:line="240" w:lineRule="auto"/>
+              <w:rPr/>
+            </w:pPr>
+            <w:r>
+              <w:rPr>
+                <w:rtl w:val="0"/>
+              </w:rPr>
+              <w:t xml:space="preserve">(85 x (1 + 14.5%)) x (1 - 1%) = 96.35 = 96</w:t>
+            </w:r>
+          </w:p>
+        </w:tc>
+        <w:tc>
+          <w:tcPr>
+            <w:shd w:fill="auto" w:val="clear"/>
+            <w:tcMar>
+              <w:top w:w="100.0" w:type="dxa"/>
+              <w:left w:w="100.0" w:type="dxa"/>
+              <w:bottom w:w="100.0" w:type="dxa"/>
+              <w:right w:w="100.0" w:type="dxa"/>
+            </w:tcMar>
+            <w:vAlign w:val="top"/>
+          </w:tcPr>
+          <w:p>
+            <w:pPr>
+              <w:keepNext w:val="0"/>
+              <w:keepLines w:val="0"/>
+              <w:pageBreakBefore w:val="0"/>
+              <w:widowControl w:val="0"/>
+              <w:pBdr>
+                <w:top w:space="0" w:sz="0" w:val="nil"/>
+                <w:left w:space="0" w:sz="0" w:val="nil"/>
+                <w:bottom w:space="0" w:sz="0" w:val="nil"/>
+                <w:right w:space="0" w:sz="0" w:val="nil"/>
+                <w:between w:space="0" w:sz="0" w:val="nil"/>
+              </w:pBdr>
+              <w:shd w:fill="auto" w:val="clear"/>
+              <w:spacing w:after="0" w:before="0" w:line="240" w:lineRule="auto"/>
+              <w:ind w:left="0" w:right="0" w:firstLine="0"/>
+              <w:jc w:val="left"/>
+              <w:rPr/>
+            </w:pPr>
+            <w:r>
+              <w:rPr>
+                <w:rFonts w:ascii="Arial Unicode MS" w:cs="Arial Unicode MS" w:eastAsia="Arial Unicode MS" w:hAnsi="Arial Unicode MS"/>
+                <w:rtl w:val="0"/>
+              </w:rPr>
+              <w:t xml:space="preserve">236%以上的百业成员就比300%的其他玩家利润大了，可以参考下一行。</w:t>
+            </w:r>
+          </w:p>
+        </w:tc>
+      </w:tr>
+      <w:tr>
+        <w:trPr>
+          <w:cantSplit w:val="0"/>
+          <w:tblHeader w:val="0"/>
+        </w:trPr>
+        <w:tc>
+          <w:tcPr>
+            <w:shd w:fill="auto" w:val="clear"/>
+            <w:tcMar>
+              <w:top w:w="100.0" w:type="dxa"/>
+              <w:left w:w="100.0" w:type="dxa"/>
+              <w:bottom w:w="100.0" w:type="dxa"/>
+              <w:right w:w="100.0" w:type="dxa"/>
+            </w:tcMar>
+            <w:vAlign w:val="top"/>
+          </w:tcPr>
+          <w:p>
+            <w:pPr>
+              <w:keepNext w:val="0"/>
+              <w:keepLines w:val="0"/>
+              <w:pageBreakBefore w:val="0"/>
+              <w:widowControl w:val="0"/>
+              <w:pBdr>
+                <w:top w:space="0" w:sz="0" w:val="nil"/>
+                <w:left w:space="0" w:sz="0" w:val="nil"/>
+                <w:bottom w:space="0" w:sz="0" w:val="nil"/>
+                <w:right w:space="0" w:sz="0" w:val="nil"/>
+                <w:between w:space="0" w:sz="0" w:val="nil"/>
+              </w:pBdr>
+              <w:shd w:fill="auto" w:val="clear"/>
+              <w:spacing w:after="0" w:before="0" w:line="240" w:lineRule="auto"/>
+              <w:ind w:left="0" w:right="0" w:firstLine="0"/>
+              <w:jc w:val="left"/>
+              <w:rPr/>
+            </w:pPr>
+            <w:r>
+              <w:rPr>
+                <w:rtl w:val="0"/>
+              </w:rPr>
+              <w:t xml:space="preserve">300%</w:t>
+            </w:r>
+          </w:p>
+        </w:tc>
+        <w:tc>
+          <w:tcPr>
+            <w:shd w:fill="auto" w:val="clear"/>
+            <w:tcMar>
+              <w:top w:w="100.0" w:type="dxa"/>
+              <w:left w:w="100.0" w:type="dxa"/>
+              <w:bottom w:w="100.0" w:type="dxa"/>
+              <w:right w:w="100.0" w:type="dxa"/>
+            </w:tcMar>
+            <w:vAlign w:val="top"/>
+          </w:tcPr>
+          <w:p>
+            <w:pPr>
+              <w:keepNext w:val="0"/>
+              <w:keepLines w:val="0"/>
+              <w:pageBreakBefore w:val="0"/>
+              <w:widowControl w:val="0"/>
+              <w:pBdr>
+                <w:top w:space="0" w:sz="0" w:val="nil"/>
+                <w:left w:space="0" w:sz="0" w:val="nil"/>
+                <w:bottom w:space="0" w:sz="0" w:val="nil"/>
+                <w:right w:space="0" w:sz="0" w:val="nil"/>
+                <w:between w:space="0" w:sz="0" w:val="nil"/>
+              </w:pBdr>
+              <w:shd w:fill="auto" w:val="clear"/>
+              <w:spacing w:after="0" w:before="0" w:line="240" w:lineRule="auto"/>
+              <w:ind w:left="0" w:right="0" w:firstLine="0"/>
+              <w:jc w:val="left"/>
+              <w:rPr/>
+            </w:pPr>
+            <w:r>
+              <w:rPr>
+                <w:rtl w:val="0"/>
+              </w:rPr>
+              <w:t xml:space="preserve">108</w:t>
+            </w:r>
+          </w:p>
+        </w:tc>
+        <w:tc>
+          <w:tcPr>
+            <w:shd w:fill="auto" w:val="clear"/>
+            <w:tcMar>
+              <w:top w:w="100.0" w:type="dxa"/>
+              <w:left w:w="100.0" w:type="dxa"/>
+              <w:bottom w:w="100.0" w:type="dxa"/>
+              <w:right w:w="100.0" w:type="dxa"/>
+            </w:tcMar>
+            <w:vAlign w:val="top"/>
+          </w:tcPr>
+          <w:p>
+            <w:pPr>
+              <w:keepNext w:val="0"/>
+              <w:keepLines w:val="0"/>
+              <w:pageBreakBefore w:val="0"/>
+              <w:widowControl w:val="0"/>
+              <w:pBdr>
+                <w:top w:space="0" w:sz="0" w:val="nil"/>
+                <w:left w:space="0" w:sz="0" w:val="nil"/>
+                <w:bottom w:space="0" w:sz="0" w:val="nil"/>
+                <w:right w:space="0" w:sz="0" w:val="nil"/>
+                <w:between w:space="0" w:sz="0" w:val="nil"/>
+              </w:pBdr>
+              <w:shd w:fill="auto" w:val="clear"/>
+              <w:spacing w:after="0" w:before="0" w:line="240" w:lineRule="auto"/>
+              <w:ind w:left="0" w:right="0" w:firstLine="0"/>
+              <w:jc w:val="left"/>
+              <w:rPr/>
+            </w:pPr>
+            <w:r>
+              <w:rPr>
+                <w:rtl w:val="0"/>
+              </w:rPr>
+              <w:t xml:space="preserve">108 - 108 x 11% = 96.12 = 96</w:t>
+            </w:r>
+          </w:p>
+        </w:tc>
+        <w:tc>
+          <w:tcPr>
+            <w:shd w:fill="auto" w:val="clear"/>
+            <w:tcMar>
+              <w:top w:w="100.0" w:type="dxa"/>
+              <w:left w:w="100.0" w:type="dxa"/>
+              <w:bottom w:w="100.0" w:type="dxa"/>
+              <w:right w:w="100.0" w:type="dxa"/>
+            </w:tcMar>
+            <w:vAlign w:val="top"/>
+          </w:tcPr>
+          <w:p>
+            <w:pPr>
+              <w:widowControl w:val="0"/>
+              <w:spacing w:line="240" w:lineRule="auto"/>
+              <w:rPr/>
+            </w:pPr>
+            <w:r>
+              <w:rPr>
+                <w:rtl w:val="0"/>
+              </w:rPr>
+              <w:t xml:space="preserve">(108 x (1 + 14.5%)) x (1 - 1%) = 122.42 = 122</w:t>
+            </w:r>
+          </w:p>
+        </w:tc>
+        <w:tc>
+          <w:tcPr>
+            <w:shd w:fill="auto" w:val="clear"/>
+            <w:tcMar>
+              <w:top w:w="100.0" w:type="dxa"/>
+              <w:left w:w="100.0" w:type="dxa"/>
+              <w:bottom w:w="100.0" w:type="dxa"/>
+              <w:right w:w="100.0" w:type="dxa"/>
+            </w:tcMar>
+            <w:vAlign w:val="top"/>
+          </w:tcPr>
+          <w:p>
+            <w:pPr>
+              <w:keepNext w:val="0"/>
+              <w:keepLines w:val="0"/>
+              <w:pageBreakBefore w:val="0"/>
+              <w:widowControl w:val="0"/>
+              <w:pBdr>
+                <w:top w:space="0" w:sz="0" w:val="nil"/>
+                <w:left w:space="0" w:sz="0" w:val="nil"/>
+                <w:bottom w:space="0" w:sz="0" w:val="nil"/>
+                <w:right w:space="0" w:sz="0" w:val="nil"/>
+                <w:between w:space="0" w:sz="0" w:val="nil"/>
+              </w:pBdr>
+              <w:shd w:fill="auto" w:val="clear"/>
+              <w:spacing w:after="0" w:before="0" w:line="240" w:lineRule="auto"/>
+              <w:ind w:left="0" w:right="0" w:firstLine="0"/>
+              <w:jc w:val="left"/>
+              <w:rPr/>
+            </w:pPr>
+            <w:r>
+              <w:rPr>
+                <w:rFonts w:ascii="Arial Unicode MS" w:cs="Arial Unicode MS" w:eastAsia="Arial Unicode MS" w:hAnsi="Arial Unicode MS"/>
+                <w:rtl w:val="0"/>
+              </w:rPr>
+              <w:t xml:space="preserve">300%其他玩家 =236%百业成员</w:t>
+            </w:r>
+          </w:p>
+        </w:tc>
+      </w:tr>
+    </w:tbl>
+    <w:p>
+      <w:pPr>
+        <w:rPr/>
+      </w:pPr>
+      <w:r>
+        <w:rPr>
+          <w:rtl w:val="0"/>
+        </w:rPr>
+      </w:r>
+    </w:p>
+    <w:p>
+      <w:pPr>
+        <w:rPr>
+          <w:b w:val="1"/>
+          <w:bCs w:val="1"/>
+        </w:rPr>
+      </w:pPr>
+      <w:r>
+        <w:rPr>
+          <w:rFonts w:ascii="Arial Unicode MS" w:cs="Arial Unicode MS" w:eastAsia="Arial Unicode MS" w:hAnsi="Arial Unicode MS"/>
+          <w:b w:val="1"/>
+          <w:bCs w:val="1"/>
+          <w:rtl w:val="0"/>
+        </w:rPr>
+        <w:t xml:space="preserve">卖给世界玩家不亏的算法：</w:t>
+      </w:r>
+    </w:p>
+    <w:p>
+      <w:pPr>
+        <w:rPr/>
+      </w:pPr>
+      <w:r>
+        <w:rPr>
+          <w:rFonts w:ascii="Arial Unicode MS" w:cs="Arial Unicode MS" w:eastAsia="Arial Unicode MS" w:hAnsi="Arial Unicode MS"/>
+          <w:rtl w:val="0"/>
+        </w:rPr>
+        <w:t xml:space="preserve">假设商品入手价为Y，我们要求的是价格涨幅到X%的时候，卖出的价格扣除掉11%的税收仍然大于等于Y，那么按照这个要求我们列以下公式（此处 * 为乘号）：</w:t>
+      </w:r>
+    </w:p>
+    <w:p>
+      <w:pPr>
+        <w:rPr/>
+      </w:pPr>
+      <w:r>
+        <w:rPr>
+          <w:rtl w:val="0"/>
+        </w:rPr>
+        <w:t xml:space="preserve">Y * X% - (Y * X% * 11%)  &gt;= Y</w:t>
+      </w:r>
+    </w:p>
+    <w:p>
+      <w:pPr>
+        <w:rPr/>
+      </w:pPr>
+      <w:r>
+        <w:rPr>
+          <w:rFonts w:ascii="Arial Unicode MS" w:cs="Arial Unicode MS" w:eastAsia="Arial Unicode MS" w:hAnsi="Arial Unicode MS"/>
+          <w:rtl w:val="0"/>
+        </w:rPr>
+        <w:t xml:space="preserve">两遍公式简化可得： X% &gt;= 1 / (1 - 11%)</w:t>
+      </w:r>
+    </w:p>
+    <w:p>
+      <w:pPr>
+        <w:rPr/>
+      </w:pPr>
+      <w:r>
+        <w:rPr>
+          <w:rFonts w:ascii="Arial Unicode MS" w:cs="Arial Unicode MS" w:eastAsia="Arial Unicode MS" w:hAnsi="Arial Unicode MS"/>
+          <w:rtl w:val="0"/>
+        </w:rPr>
+        <w:t xml:space="preserve">所以 X% = 112.36%，向上取整 (ceiling) 113%</w:t>
+      </w:r>
+    </w:p>
+    <w:p>
+      <w:pPr>
+        <w:rPr/>
+      </w:pPr>
+      <w:r>
+        <w:rPr>
+          <w:rtl w:val="0"/>
+        </w:rPr>
+      </w:r>
+    </w:p>
+    <w:p>
+      <w:pPr>
+        <w:rPr>
+          <w:b w:val="1"/>
+          <w:bCs w:val="1"/>
+        </w:rPr>
+      </w:pPr>
+      <w:r>
+        <w:rPr>
+          <w:rFonts w:ascii="Arial Unicode MS" w:cs="Arial Unicode MS" w:eastAsia="Arial Unicode MS" w:hAnsi="Arial Unicode MS"/>
+          <w:b w:val="1"/>
+          <w:bCs w:val="1"/>
+          <w:rtl w:val="0"/>
+        </w:rPr>
+        <w:t xml:space="preserve">卖给百业成员的话，浮动百分率多少才比300%高？</w:t>
+      </w:r>
+    </w:p>
+    <w:p>
+      <w:pPr>
+        <w:rPr/>
+      </w:pPr>
+      <w:r>
+        <w:rPr>
+          <w:rFonts w:ascii="Arial Unicode MS" w:cs="Arial Unicode MS" w:eastAsia="Arial Unicode MS" w:hAnsi="Arial Unicode MS"/>
+          <w:rtl w:val="0"/>
+        </w:rPr>
+        <w:t xml:space="preserve">假设商品入手价为Y，我们要解的是，百业成员价格浮动大于X%之后，比卖给世界其他玩家300%要更高。那么可以列一下公式（此处 * 为乘号）：</w:t>
+      </w:r>
+    </w:p>
+    <w:p>
+      <w:pPr>
+        <w:rPr/>
+      </w:pPr>
+      <w:r>
+        <w:rPr>
+          <w:rtl w:val="0"/>
+        </w:rPr>
+      </w:r>
+    </w:p>
+    <w:p>
+      <w:pPr>
+        <w:rPr/>
+      </w:pPr>
+      <w:r>
+        <w:rPr>
+          <w:rtl w:val="0"/>
+        </w:rPr>
+        <w:t xml:space="preserve">Y *300% - (Y * 300% * 11%) &lt;= (Y * X% * (1 + 14.5%)) * (1 - 1%)</w:t>
+      </w:r>
+    </w:p>
+    <w:p>
+      <w:pPr>
+        <w:rPr/>
+      </w:pPr>
+      <w:r>
+        <w:rPr/>
+        <w:drawing>
+          <wp:inline distB="114300" distT="114300" distL="114300" distR="114300">
+            <wp:extent cx="5943600" cy="4838700"/>
+            <wp:effectExtent b="0" l="0" r="0" t="0"/>
+            <wp:docPr id="9" name="image5.png"/>
+            <a:graphic>
+              <a:graphicData uri="http://schemas.openxmlformats.org/drawingml/2006/picture">
+                <pic:pic>
+                  <pic:nvPicPr>
+                    <pic:cNvPr id="0" name="image5.png"/>
+                    <pic:cNvPicPr preferRelativeResize="0"/>
+                  </pic:nvPicPr>
+                  <pic:blipFill>
+                    <a:blip r:embed="rId17"/>
+                    <a:srcRect b="0" l="0" r="0" t="0"/>
+                    <a:stretch>
+                      <a:fillRect/>
+                    </a:stretch>
+                  </pic:blipFill>
+                  <pic:spPr>
+                    <a:xfrm>
+                      <a:off x="0" y="0"/>
+                      <a:ext cx="5943600" cy="4838700"/>
+                    </a:xfrm>
+                    <a:prstGeom prst="rect"/>
+                    <a:ln/>
+                  </pic:spPr>
+                </pic:pic>
+              </a:graphicData>
+            </a:graphic>
+          </wp:inline>
+        </w:drawing>
+      </w:r>
+      <w:r>
+        <w:rPr>
+          <w:rtl w:val="0"/>
+        </w:rPr>
+      </w:r>
+    </w:p>
+    <w:p>
+      <w:pPr>
+        <w:rPr/>
+      </w:pPr>
+      <w:r>
+        <w:rPr>
+          <w:rtl w:val="0"/>
+        </w:rPr>
+      </w:r>
+    </w:p>
+    <w:p>
+      <w:pPr>
+        <w:rPr/>
+      </w:pPr>
+      <w:r>
+        <w:rPr>
+          <w:rtl w:val="0"/>
+        </w:rPr>
+      </w:r>
+    </w:p>
+    <w:p>
+      <w:pPr>
+        <w:rPr/>
+      </w:pPr>
+      <w:r>
+        <w:rPr>
+          <w:rtl w:val="0"/>
+        </w:rPr>
+      </w:r>
+    </w:p>
     <w:sectPr>
       <w:pgSz w:h="15840" w:w="12240" w:orient="portrait"/>
       <w:pgMar w:bottom="1440" w:top="1440" w:left="1440" w:right="1440" w:header="720" w:footer="720"/>
@@ -2516,6 +3907,116 @@
   <w:abstractNum w:abstractNumId="2">
     <w:lvl w:ilvl="0">
       <w:start w:val="1"/>
+      <w:numFmt w:val="bullet"/>
+      <w:lvlText w:val="●"/>
+      <w:lvlJc w:val="left"/>
+      <w:pPr>
+        <w:ind w:left="720" w:hanging="360"/>
+      </w:pPr>
+      <w:rPr>
+        <w:u w:val="none"/>
+      </w:rPr>
+    </w:lvl>
+    <w:lvl w:ilvl="1">
+      <w:start w:val="1"/>
+      <w:numFmt w:val="bullet"/>
+      <w:lvlText w:val="○"/>
+      <w:lvlJc w:val="left"/>
+      <w:pPr>
+        <w:ind w:left="1440" w:hanging="360"/>
+      </w:pPr>
+      <w:rPr>
+        <w:u w:val="none"/>
+      </w:rPr>
+    </w:lvl>
+    <w:lvl w:ilvl="2">
+      <w:start w:val="1"/>
+      <w:numFmt w:val="bullet"/>
+      <w:lvlText w:val="■"/>
+      <w:lvlJc w:val="left"/>
+      <w:pPr>
+        <w:ind w:left="2160" w:hanging="360"/>
+      </w:pPr>
+      <w:rPr>
+        <w:u w:val="none"/>
+      </w:rPr>
+    </w:lvl>
+    <w:lvl w:ilvl="3">
+      <w:start w:val="1"/>
+      <w:numFmt w:val="bullet"/>
+      <w:lvlText w:val="●"/>
+      <w:lvlJc w:val="left"/>
+      <w:pPr>
+        <w:ind w:left="2880" w:hanging="360"/>
+      </w:pPr>
+      <w:rPr>
+        <w:u w:val="none"/>
+      </w:rPr>
+    </w:lvl>
+    <w:lvl w:ilvl="4">
+      <w:start w:val="1"/>
+      <w:numFmt w:val="bullet"/>
+      <w:lvlText w:val="○"/>
+      <w:lvlJc w:val="left"/>
+      <w:pPr>
+        <w:ind w:left="3600" w:hanging="360"/>
+      </w:pPr>
+      <w:rPr>
+        <w:u w:val="none"/>
+      </w:rPr>
+    </w:lvl>
+    <w:lvl w:ilvl="5">
+      <w:start w:val="1"/>
+      <w:numFmt w:val="bullet"/>
+      <w:lvlText w:val="■"/>
+      <w:lvlJc w:val="left"/>
+      <w:pPr>
+        <w:ind w:left="4320" w:hanging="360"/>
+      </w:pPr>
+      <w:rPr>
+        <w:u w:val="none"/>
+      </w:rPr>
+    </w:lvl>
+    <w:lvl w:ilvl="6">
+      <w:start w:val="1"/>
+      <w:numFmt w:val="bullet"/>
+      <w:lvlText w:val="●"/>
+      <w:lvlJc w:val="left"/>
+      <w:pPr>
+        <w:ind w:left="5040" w:hanging="360"/>
+      </w:pPr>
+      <w:rPr>
+        <w:u w:val="none"/>
+      </w:rPr>
+    </w:lvl>
+    <w:lvl w:ilvl="7">
+      <w:start w:val="1"/>
+      <w:numFmt w:val="bullet"/>
+      <w:lvlText w:val="○"/>
+      <w:lvlJc w:val="left"/>
+      <w:pPr>
+        <w:ind w:left="5760" w:hanging="360"/>
+      </w:pPr>
+      <w:rPr>
+        <w:u w:val="none"/>
+      </w:rPr>
+    </w:lvl>
+    <w:lvl w:ilvl="8">
+      <w:start w:val="1"/>
+      <w:numFmt w:val="bullet"/>
+      <w:lvlText w:val="■"/>
+      <w:lvlJc w:val="left"/>
+      <w:pPr>
+        <w:ind w:left="6480" w:hanging="360"/>
+      </w:pPr>
+      <w:rPr>
+        <w:u w:val="none"/>
+      </w:rPr>
+    </w:lvl>
+  </w:abstractNum>
+  <w:abstractNum w:abstractNumId="3">
+    <w:lvl w:ilvl="0">
+      <w:start w:val="1"/>
       <w:numFmt w:val="decimal"/>
       <w:lvlText w:val="%1."/>
       <w:lvlJc w:val="left"/>
@@ -2623,7 +4124,7 @@
       </w:rPr>
     </w:lvl>
   </w:abstractNum>
-  <w:abstractNum w:abstractNumId="3">
+  <w:abstractNum w:abstractNumId="4">
     <w:lvl w:ilvl="0">
       <w:start w:val="1"/>
       <w:numFmt w:val="decimal"/>
@@ -2741,6 +4242,9 @@
   </w:num>
   <w:num w:numId="3">
     <w:abstractNumId w:val="3"/>
+  </w:num>
+  <w:num w:numId="4">
+    <w:abstractNumId w:val="4"/>
   </w:num>
 </w:numbering>
 </file>
@@ -2911,6 +4415,13 @@
     </w:rPr>
   </w:style>
   <w:style w:type="table" w:styleId="Table1">
+    <w:basedOn w:val="TableNormal"/>
+    <w:tblPr>
+      <w:tblStyleRowBandSize w:val="1"/>
+      <w:tblStyleColBandSize w:val="1"/>
+    </w:tblPr>
+  </w:style>
+  <w:style w:type="table" w:styleId="Table2">
     <w:basedOn w:val="TableNormal"/>
     <w:tblPr>
       <w:tblStyleRowBandSize w:val="1"/>

</xml_diff>